<commit_message>
Confidentiality: remove 'kiosk' terminology + add technical documentation
- Replace every 'kiosk' mention with neutral wording ("restricted exam mode" /
  "single-application restriction") across SPEC.md, the two spec .txt files, the
  ExamView code comment, and inside ScoreCode_Spec_v4.docx (edited in place).
- Add docs/TECHNICAL_DOCUMENTATION.md: a full, paper-oriented reference
  (architecture, multi-tenancy, security model, methodology, evaluation, limits).

Co-Authored-By: Claude Opus 4.8 <noreply@anthropic.com>
</commit_message>
<xml_diff>
--- a/ScoreCode_Spec_v4.docx
+++ b/ScoreCode_Spec_v4.docx
@@ -6142,7 +6142,7 @@
           <w:sz w:val="22"/>
           <w:szCs w:val="22"/>
         </w:rPr>
-        <w:t xml:space="preserve">For maximum effectiveness, configure exam machines with Windows Assigned Access (single-app kiosk) for a dedicated exam user account. This is an OS-level configuration done once at deployment, not per-exam.</w:t>
+        <w:t xml:space="preserve">For maximum effectiveness, configure exam machines with Windows Assigned Access (single-app restriction) for a dedicated exam user account. This is an OS-level configuration done once at deployment, not per-exam.</w:t>
       </w:r>
     </w:p>
     <w:p>
@@ -9237,7 +9237,7 @@
                 <w:sz w:val="20"/>
                 <w:szCs w:val="20"/>
               </w:rPr>
-              <w:t xml:space="preserve">Native Windows. Full kiosk capability. Strong academic defensibility. MVVM architecture. Self-contained single-file publish.</w:t>
+              <w:t xml:space="preserve">Native Windows. Full restriction capability. Strong academic defensibility. MVVM architecture. Self-contained single-file publish.</w:t>
             </w:r>
           </w:p>
         </w:tc>
@@ -13878,7 +13878,7 @@
                 <w:sz w:val="20"/>
                 <w:szCs w:val="20"/>
               </w:rPr>
-              <w:t xml:space="preserve">Windows Assigned Access kiosk config</w:t>
+              <w:t xml:space="preserve">Windows Assigned Access restriction config</w:t>
             </w:r>
           </w:p>
         </w:tc>

</xml_diff>